<commit_message>
Mark capacity C = 10 as validated
refs #3
</commit_message>
<xml_diff>
--- a/docs/decisions.docx
+++ b/docs/decisions.docx
@@ -265,7 +265,7 @@
                 <w:sz w:val="19"/>
                 <w:szCs w:val="19"/>
               </w:rPr>
-              <w:t xml:space="preserve">Proposée — à valider avec Dia Eddine</w:t>
+              <w:t xml:space="preserve">Adoptée</w:t>
             </w:r>
           </w:p>
         </w:tc>
@@ -679,7 +679,7 @@
         <w:t xml:space="preserve">Statut :</w:t>
       </w:r>
       <w:r>
-        <w:t xml:space="preserve"> Proposée — à valider avec Dia Eddine    </w:t>
+        <w:t xml:space="preserve"> Adoptée (validée avec Dia Eddine)    </w:t>
       </w:r>
       <w:r>
         <w:rPr>

</xml_diff>

<commit_message>
Validate the spec: WTP model error, Q-learning starting choices, env interface, work split
Adds decisions D6 to D9 to the decision log.

closes #3, closes #6
</commit_message>
<xml_diff>
--- a/docs/decisions.docx
+++ b/docs/decisions.docx
@@ -615,6 +615,386 @@
                 <w:szCs w:val="19"/>
               </w:rPr>
               <w:t xml:space="preserve">10 seeds dès le premier lancement des expériences</w:t>
+            </w:r>
+          </w:p>
+        </w:tc>
+        <w:tc>
+          <w:tcPr>
+            <w:tcW w:type="dxa" w:w="2300"/>
+            <w:tcBorders>
+              <w:top w:val="single" w:color="BFBFBF" w:sz="4"/>
+              <w:left w:val="single" w:color="BFBFBF" w:sz="4"/>
+              <w:bottom w:val="single" w:color="BFBFBF" w:sz="4"/>
+              <w:right w:val="single" w:color="BFBFBF" w:sz="4"/>
+            </w:tcBorders>
+            <w:tcMar>
+              <w:top w:type="dxa" w:w="60"/>
+              <w:left w:type="dxa" w:w="100"/>
+              <w:bottom w:type="dxa" w:w="60"/>
+              <w:right w:type="dxa" w:w="100"/>
+            </w:tcMar>
+          </w:tcPr>
+          <w:p>
+            <w:pPr>
+              <w:jc w:val="center"/>
+            </w:pPr>
+            <w:r>
+              <w:rPr>
+                <w:b w:val="false"/>
+                <w:bCs w:val="false"/>
+                <w:sz w:val="19"/>
+                <w:szCs w:val="19"/>
+              </w:rPr>
+              <w:t xml:space="preserve">Adoptée</w:t>
+            </w:r>
+          </w:p>
+        </w:tc>
+      </w:tr>
+      <w:tr>
+        <w:tc>
+          <w:tcPr>
+            <w:tcW w:type="dxa" w:w="900"/>
+            <w:tcBorders>
+              <w:top w:val="single" w:color="BFBFBF" w:sz="4"/>
+              <w:left w:val="single" w:color="BFBFBF" w:sz="4"/>
+              <w:bottom w:val="single" w:color="BFBFBF" w:sz="4"/>
+              <w:right w:val="single" w:color="BFBFBF" w:sz="4"/>
+            </w:tcBorders>
+            <w:tcMar>
+              <w:top w:type="dxa" w:w="60"/>
+              <w:left w:type="dxa" w:w="100"/>
+              <w:bottom w:type="dxa" w:w="60"/>
+              <w:right w:type="dxa" w:w="100"/>
+            </w:tcMar>
+          </w:tcPr>
+          <w:p>
+            <w:pPr>
+              <w:jc w:val="left"/>
+            </w:pPr>
+            <w:r>
+              <w:rPr>
+                <w:b w:val="false"/>
+                <w:bCs w:val="false"/>
+                <w:sz w:val="19"/>
+                <w:szCs w:val="19"/>
+              </w:rPr>
+              <w:t xml:space="preserve">D6</w:t>
+            </w:r>
+          </w:p>
+        </w:tc>
+        <w:tc>
+          <w:tcPr>
+            <w:tcW w:type="dxa" w:w="5826"/>
+            <w:tcBorders>
+              <w:top w:val="single" w:color="BFBFBF" w:sz="4"/>
+              <w:left w:val="single" w:color="BFBFBF" w:sz="4"/>
+              <w:bottom w:val="single" w:color="BFBFBF" w:sz="4"/>
+              <w:right w:val="single" w:color="BFBFBF" w:sz="4"/>
+            </w:tcBorders>
+            <w:tcMar>
+              <w:top w:type="dxa" w:w="60"/>
+              <w:left w:type="dxa" w:w="100"/>
+              <w:bottom w:type="dxa" w:w="60"/>
+              <w:right w:type="dxa" w:w="100"/>
+            </w:tcMar>
+          </w:tcPr>
+          <w:p>
+            <w:pPr>
+              <w:jc w:val="left"/>
+            </w:pPr>
+            <w:r>
+              <w:rPr>
+                <w:b w:val="false"/>
+                <w:bCs w:val="false"/>
+                <w:sz w:val="19"/>
+                <w:szCs w:val="19"/>
+              </w:rPr>
+              <w:t xml:space="preserve">Erreur de modèle pour E2 : fausser la WTP</w:t>
+            </w:r>
+          </w:p>
+        </w:tc>
+        <w:tc>
+          <w:tcPr>
+            <w:tcW w:type="dxa" w:w="2300"/>
+            <w:tcBorders>
+              <w:top w:val="single" w:color="BFBFBF" w:sz="4"/>
+              <w:left w:val="single" w:color="BFBFBF" w:sz="4"/>
+              <w:bottom w:val="single" w:color="BFBFBF" w:sz="4"/>
+              <w:right w:val="single" w:color="BFBFBF" w:sz="4"/>
+            </w:tcBorders>
+            <w:tcMar>
+              <w:top w:type="dxa" w:w="60"/>
+              <w:left w:type="dxa" w:w="100"/>
+              <w:bottom w:type="dxa" w:w="60"/>
+              <w:right w:type="dxa" w:w="100"/>
+            </w:tcMar>
+          </w:tcPr>
+          <w:p>
+            <w:pPr>
+              <w:jc w:val="center"/>
+            </w:pPr>
+            <w:r>
+              <w:rPr>
+                <w:b w:val="false"/>
+                <w:bCs w:val="false"/>
+                <w:sz w:val="19"/>
+                <w:szCs w:val="19"/>
+              </w:rPr>
+              <w:t xml:space="preserve">Adoptée</w:t>
+            </w:r>
+          </w:p>
+        </w:tc>
+      </w:tr>
+      <w:tr>
+        <w:tc>
+          <w:tcPr>
+            <w:tcW w:type="dxa" w:w="900"/>
+            <w:tcBorders>
+              <w:top w:val="single" w:color="BFBFBF" w:sz="4"/>
+              <w:left w:val="single" w:color="BFBFBF" w:sz="4"/>
+              <w:bottom w:val="single" w:color="BFBFBF" w:sz="4"/>
+              <w:right w:val="single" w:color="BFBFBF" w:sz="4"/>
+            </w:tcBorders>
+            <w:tcMar>
+              <w:top w:type="dxa" w:w="60"/>
+              <w:left w:type="dxa" w:w="100"/>
+              <w:bottom w:type="dxa" w:w="60"/>
+              <w:right w:type="dxa" w:w="100"/>
+            </w:tcMar>
+          </w:tcPr>
+          <w:p>
+            <w:pPr>
+              <w:jc w:val="left"/>
+            </w:pPr>
+            <w:r>
+              <w:rPr>
+                <w:b w:val="false"/>
+                <w:bCs w:val="false"/>
+                <w:sz w:val="19"/>
+                <w:szCs w:val="19"/>
+              </w:rPr>
+              <w:t xml:space="preserve">D7</w:t>
+            </w:r>
+          </w:p>
+        </w:tc>
+        <w:tc>
+          <w:tcPr>
+            <w:tcW w:type="dxa" w:w="5826"/>
+            <w:tcBorders>
+              <w:top w:val="single" w:color="BFBFBF" w:sz="4"/>
+              <w:left w:val="single" w:color="BFBFBF" w:sz="4"/>
+              <w:bottom w:val="single" w:color="BFBFBF" w:sz="4"/>
+              <w:right w:val="single" w:color="BFBFBF" w:sz="4"/>
+            </w:tcBorders>
+            <w:tcMar>
+              <w:top w:type="dxa" w:w="60"/>
+              <w:left w:type="dxa" w:w="100"/>
+              <w:bottom w:type="dxa" w:w="60"/>
+              <w:right w:type="dxa" w:w="100"/>
+            </w:tcMar>
+          </w:tcPr>
+          <w:p>
+            <w:pPr>
+              <w:jc w:val="left"/>
+            </w:pPr>
+            <w:r>
+              <w:rPr>
+                <w:b w:val="false"/>
+                <w:bCs w:val="false"/>
+                <w:sz w:val="19"/>
+                <w:szCs w:val="19"/>
+              </w:rPr>
+              <w:t xml:space="preserve">Q-learning : choix de départ fidèles au cours</w:t>
+            </w:r>
+          </w:p>
+        </w:tc>
+        <w:tc>
+          <w:tcPr>
+            <w:tcW w:type="dxa" w:w="2300"/>
+            <w:tcBorders>
+              <w:top w:val="single" w:color="BFBFBF" w:sz="4"/>
+              <w:left w:val="single" w:color="BFBFBF" w:sz="4"/>
+              <w:bottom w:val="single" w:color="BFBFBF" w:sz="4"/>
+              <w:right w:val="single" w:color="BFBFBF" w:sz="4"/>
+            </w:tcBorders>
+            <w:tcMar>
+              <w:top w:type="dxa" w:w="60"/>
+              <w:left w:type="dxa" w:w="100"/>
+              <w:bottom w:type="dxa" w:w="60"/>
+              <w:right w:type="dxa" w:w="100"/>
+            </w:tcMar>
+          </w:tcPr>
+          <w:p>
+            <w:pPr>
+              <w:jc w:val="center"/>
+            </w:pPr>
+            <w:r>
+              <w:rPr>
+                <w:b w:val="false"/>
+                <w:bCs w:val="false"/>
+                <w:sz w:val="19"/>
+                <w:szCs w:val="19"/>
+              </w:rPr>
+              <w:t xml:space="preserve">Adoptée</w:t>
+            </w:r>
+          </w:p>
+        </w:tc>
+      </w:tr>
+      <w:tr>
+        <w:tc>
+          <w:tcPr>
+            <w:tcW w:type="dxa" w:w="900"/>
+            <w:tcBorders>
+              <w:top w:val="single" w:color="BFBFBF" w:sz="4"/>
+              <w:left w:val="single" w:color="BFBFBF" w:sz="4"/>
+              <w:bottom w:val="single" w:color="BFBFBF" w:sz="4"/>
+              <w:right w:val="single" w:color="BFBFBF" w:sz="4"/>
+            </w:tcBorders>
+            <w:tcMar>
+              <w:top w:type="dxa" w:w="60"/>
+              <w:left w:type="dxa" w:w="100"/>
+              <w:bottom w:type="dxa" w:w="60"/>
+              <w:right w:type="dxa" w:w="100"/>
+            </w:tcMar>
+          </w:tcPr>
+          <w:p>
+            <w:pPr>
+              <w:jc w:val="left"/>
+            </w:pPr>
+            <w:r>
+              <w:rPr>
+                <w:b w:val="false"/>
+                <w:bCs w:val="false"/>
+                <w:sz w:val="19"/>
+                <w:szCs w:val="19"/>
+              </w:rPr>
+              <w:t xml:space="preserve">D8</w:t>
+            </w:r>
+          </w:p>
+        </w:tc>
+        <w:tc>
+          <w:tcPr>
+            <w:tcW w:type="dxa" w:w="5826"/>
+            <w:tcBorders>
+              <w:top w:val="single" w:color="BFBFBF" w:sz="4"/>
+              <w:left w:val="single" w:color="BFBFBF" w:sz="4"/>
+              <w:bottom w:val="single" w:color="BFBFBF" w:sz="4"/>
+              <w:right w:val="single" w:color="BFBFBF" w:sz="4"/>
+            </w:tcBorders>
+            <w:tcMar>
+              <w:top w:type="dxa" w:w="60"/>
+              <w:left w:type="dxa" w:w="100"/>
+              <w:bottom w:type="dxa" w:w="60"/>
+              <w:right w:type="dxa" w:w="100"/>
+            </w:tcMar>
+          </w:tcPr>
+          <w:p>
+            <w:pPr>
+              <w:jc w:val="left"/>
+            </w:pPr>
+            <w:r>
+              <w:rPr>
+                <w:b w:val="false"/>
+                <w:bCs w:val="false"/>
+                <w:sz w:val="19"/>
+                <w:szCs w:val="19"/>
+              </w:rPr>
+              <w:t xml:space="preserve">Interface de l'environnement : step() renvoie (state, reward, done)</w:t>
+            </w:r>
+          </w:p>
+        </w:tc>
+        <w:tc>
+          <w:tcPr>
+            <w:tcW w:type="dxa" w:w="2300"/>
+            <w:tcBorders>
+              <w:top w:val="single" w:color="BFBFBF" w:sz="4"/>
+              <w:left w:val="single" w:color="BFBFBF" w:sz="4"/>
+              <w:bottom w:val="single" w:color="BFBFBF" w:sz="4"/>
+              <w:right w:val="single" w:color="BFBFBF" w:sz="4"/>
+            </w:tcBorders>
+            <w:tcMar>
+              <w:top w:type="dxa" w:w="60"/>
+              <w:left w:type="dxa" w:w="100"/>
+              <w:bottom w:type="dxa" w:w="60"/>
+              <w:right w:type="dxa" w:w="100"/>
+            </w:tcMar>
+          </w:tcPr>
+          <w:p>
+            <w:pPr>
+              <w:jc w:val="center"/>
+            </w:pPr>
+            <w:r>
+              <w:rPr>
+                <w:b w:val="false"/>
+                <w:bCs w:val="false"/>
+                <w:sz w:val="19"/>
+                <w:szCs w:val="19"/>
+              </w:rPr>
+              <w:t xml:space="preserve">Adoptée</w:t>
+            </w:r>
+          </w:p>
+        </w:tc>
+      </w:tr>
+      <w:tr>
+        <w:tc>
+          <w:tcPr>
+            <w:tcW w:type="dxa" w:w="900"/>
+            <w:tcBorders>
+              <w:top w:val="single" w:color="BFBFBF" w:sz="4"/>
+              <w:left w:val="single" w:color="BFBFBF" w:sz="4"/>
+              <w:bottom w:val="single" w:color="BFBFBF" w:sz="4"/>
+              <w:right w:val="single" w:color="BFBFBF" w:sz="4"/>
+            </w:tcBorders>
+            <w:tcMar>
+              <w:top w:type="dxa" w:w="60"/>
+              <w:left w:type="dxa" w:w="100"/>
+              <w:bottom w:type="dxa" w:w="60"/>
+              <w:right w:type="dxa" w:w="100"/>
+            </w:tcMar>
+          </w:tcPr>
+          <w:p>
+            <w:pPr>
+              <w:jc w:val="left"/>
+            </w:pPr>
+            <w:r>
+              <w:rPr>
+                <w:b w:val="false"/>
+                <w:bCs w:val="false"/>
+                <w:sz w:val="19"/>
+                <w:szCs w:val="19"/>
+              </w:rPr>
+              <w:t xml:space="preserve">D9</w:t>
+            </w:r>
+          </w:p>
+        </w:tc>
+        <w:tc>
+          <w:tcPr>
+            <w:tcW w:type="dxa" w:w="5826"/>
+            <w:tcBorders>
+              <w:top w:val="single" w:color="BFBFBF" w:sz="4"/>
+              <w:left w:val="single" w:color="BFBFBF" w:sz="4"/>
+              <w:bottom w:val="single" w:color="BFBFBF" w:sz="4"/>
+              <w:right w:val="single" w:color="BFBFBF" w:sz="4"/>
+            </w:tcBorders>
+            <w:tcMar>
+              <w:top w:type="dxa" w:w="60"/>
+              <w:left w:type="dxa" w:w="100"/>
+              <w:bottom w:type="dxa" w:w="60"/>
+              <w:right w:type="dxa" w:w="100"/>
+            </w:tcMar>
+          </w:tcPr>
+          <w:p>
+            <w:pPr>
+              <w:jc w:val="left"/>
+            </w:pPr>
+            <w:r>
+              <w:rPr>
+                <w:b w:val="false"/>
+                <w:bCs w:val="false"/>
+                <w:sz w:val="19"/>
+                <w:szCs w:val="19"/>
+              </w:rPr>
+              <w:t xml:space="preserve">Répartition : côté « Plan » / côté « Learn »</w:t>
             </w:r>
           </w:p>
         </w:tc>
@@ -3000,6 +3380,1365 @@
       </w:pPr>
       <w:r>
         <w:t xml:space="preserve">Résultats avec intervalles de confiance : on peut dire qu'un écart n'est pas un coup de chance.</w:t>
+      </w:r>
+    </w:p>
+    <w:p>
+      <w:pPr>
+        <w:pStyle w:val="Heading2"/>
+      </w:pPr>
+      <w:r>
+        <w:t xml:space="preserve">D6 · Erreur de modèle pour E2 : fausser la WTP</w:t>
+      </w:r>
+    </w:p>
+    <w:p>
+      <w:pPr>
+        <w:spacing w:after="120"/>
+      </w:pPr>
+      <w:r>
+        <w:rPr>
+          <w:b/>
+          <w:bCs/>
+        </w:rPr>
+        <w:t xml:space="preserve">Statut :</w:t>
+      </w:r>
+      <w:r>
+        <w:t xml:space="preserve"> Adoptée (validée avec Dia Eddine)    </w:t>
+      </w:r>
+      <w:r>
+        <w:rPr>
+          <w:b/>
+          <w:bCs/>
+        </w:rPr>
+        <w:t xml:space="preserve">Date :</w:t>
+      </w:r>
+      <w:r>
+        <w:t xml:space="preserve"> 2026-10-09    </w:t>
+      </w:r>
+      <w:r>
+        <w:rPr>
+          <w:b/>
+          <w:bCs/>
+        </w:rPr>
+        <w:t xml:space="preserve">Issue :</w:t>
+      </w:r>
+      <w:r>
+        <w:t xml:space="preserve"> #3, #6</w:t>
+      </w:r>
+    </w:p>
+    <w:p>
+      <w:pPr>
+        <w:keepNext/>
+        <w:spacing w:before="160" w:after="60"/>
+      </w:pPr>
+      <w:r>
+        <w:rPr>
+          <w:b/>
+          <w:bCs/>
+          <w:color w:val="1F4E78"/>
+        </w:rPr>
+        <w:t xml:space="preserve">Contexte</w:t>
+      </w:r>
+    </w:p>
+    <w:p>
+      <w:pPr>
+        <w:spacing w:after="120"/>
+      </w:pPr>
+      <w:r>
+        <w:t xml:space="preserve">Pour E2, la DP reçoit un modèle de demande faux d'un pourcentage x. La spec laissait ouvert le choix du paramètre faussé : la WTP (ce que les clients sont prêts à payer), les arrivées λ, ou les deux.</w:t>
+      </w:r>
+    </w:p>
+    <w:p>
+      <w:pPr>
+        <w:spacing w:after="120"/>
+      </w:pPr>
+      <w:r>
+        <w:t xml:space="preserve">Mesure : la DP planifie avec le modèle faux, puis sa politique est évaluée exactement sur le vrai modèle (C = 10).</w:t>
+      </w:r>
+    </w:p>
+    <w:p>
+      <w:pPr>
+        <w:keepNext/>
+        <w:spacing w:before="160" w:after="60"/>
+      </w:pPr>
+      <w:r>
+        <w:rPr>
+          <w:b/>
+          <w:bCs/>
+          <w:color w:val="1F4E78"/>
+        </w:rPr>
+        <w:t xml:space="preserve">Options envisagées</w:t>
+      </w:r>
+    </w:p>
+    <w:p>
+      <w:pPr>
+        <w:pStyle w:val="ListParagraph"/>
+        <w:numPr>
+          <w:ilvl w:val="0"/>
+          <w:numId w:val="2"/>
+        </w:numPr>
+        <w:spacing w:after="60"/>
+      </w:pPr>
+      <w:r>
+        <w:t xml:space="preserve">Fausser la WTP (les deux moyennes × (1 + x)).</w:t>
+      </w:r>
+    </w:p>
+    <w:p>
+      <w:pPr>
+        <w:pStyle w:val="ListParagraph"/>
+        <w:numPr>
+          <w:ilvl w:val="0"/>
+          <w:numId w:val="2"/>
+        </w:numPr>
+        <w:spacing w:after="60"/>
+      </w:pPr>
+      <w:r>
+        <w:t xml:space="preserve">Fausser les arrivées λ (× (1 + x)).</w:t>
+      </w:r>
+    </w:p>
+    <w:p>
+      <w:pPr>
+        <w:pStyle w:val="ListParagraph"/>
+        <w:numPr>
+          <w:ilvl w:val="0"/>
+          <w:numId w:val="2"/>
+        </w:numPr>
+        <w:spacing w:after="60"/>
+      </w:pPr>
+      <w:r>
+        <w:t xml:space="preserve">Les deux, dans deux expériences séparées.</w:t>
+      </w:r>
+    </w:p>
+    <w:p>
+      <w:pPr>
+        <w:keepNext/>
+        <w:spacing w:before="160" w:after="60"/>
+      </w:pPr>
+      <w:r>
+        <w:rPr>
+          <w:b/>
+          <w:bCs/>
+          <w:color w:val="1F4E78"/>
+        </w:rPr>
+        <w:t xml:space="preserve">Revenu de la DP faussée, en % de l'optimum (1 193,5 €)</w:t>
+      </w:r>
+    </w:p>
+    <w:tbl>
+      <w:tblPr>
+        <w:tblW w:type="dxa" w:w="9026"/>
+        <w:tblBorders>
+          <w:top w:val="single" w:color="auto" w:sz="4"/>
+          <w:left w:val="single" w:color="auto" w:sz="4"/>
+          <w:bottom w:val="single" w:color="auto" w:sz="4"/>
+          <w:right w:val="single" w:color="auto" w:sz="4"/>
+          <w:insideH w:val="single" w:color="auto" w:sz="4"/>
+          <w:insideV w:val="single" w:color="auto" w:sz="4"/>
+        </w:tblBorders>
+      </w:tblPr>
+      <w:tblGrid>
+        <w:gridCol w:w="2426"/>
+        <w:gridCol w:w="1100"/>
+        <w:gridCol w:w="1100"/>
+        <w:gridCol w:w="1100"/>
+        <w:gridCol w:w="1100"/>
+        <w:gridCol w:w="1100"/>
+        <w:gridCol w:w="1100"/>
+      </w:tblGrid>
+      <w:tr>
+        <w:trPr>
+          <w:tblHeader/>
+        </w:trPr>
+        <w:tc>
+          <w:tcPr>
+            <w:tcW w:type="dxa" w:w="2426"/>
+            <w:tcBorders>
+              <w:top w:val="single" w:color="BFBFBF" w:sz="4"/>
+              <w:left w:val="single" w:color="BFBFBF" w:sz="4"/>
+              <w:bottom w:val="single" w:color="BFBFBF" w:sz="4"/>
+              <w:right w:val="single" w:color="BFBFBF" w:sz="4"/>
+            </w:tcBorders>
+            <w:shd w:fill="1F4E78" w:color="auto" w:val="clear"/>
+            <w:tcMar>
+              <w:top w:type="dxa" w:w="60"/>
+              <w:left w:type="dxa" w:w="100"/>
+              <w:bottom w:type="dxa" w:w="60"/>
+              <w:right w:type="dxa" w:w="100"/>
+            </w:tcMar>
+          </w:tcPr>
+          <w:p>
+            <w:pPr>
+              <w:jc w:val="left"/>
+            </w:pPr>
+            <w:r>
+              <w:rPr>
+                <w:b/>
+                <w:bCs/>
+                <w:color w:val="FFFFFF"/>
+                <w:sz w:val="19"/>
+                <w:szCs w:val="19"/>
+              </w:rPr>
+              <w:t xml:space="preserve">Erreur x</w:t>
+            </w:r>
+          </w:p>
+        </w:tc>
+        <w:tc>
+          <w:tcPr>
+            <w:tcW w:type="dxa" w:w="1100"/>
+            <w:tcBorders>
+              <w:top w:val="single" w:color="BFBFBF" w:sz="4"/>
+              <w:left w:val="single" w:color="BFBFBF" w:sz="4"/>
+              <w:bottom w:val="single" w:color="BFBFBF" w:sz="4"/>
+              <w:right w:val="single" w:color="BFBFBF" w:sz="4"/>
+            </w:tcBorders>
+            <w:shd w:fill="1F4E78" w:color="auto" w:val="clear"/>
+            <w:tcMar>
+              <w:top w:type="dxa" w:w="60"/>
+              <w:left w:type="dxa" w:w="100"/>
+              <w:bottom w:type="dxa" w:w="60"/>
+              <w:right w:type="dxa" w:w="100"/>
+            </w:tcMar>
+          </w:tcPr>
+          <w:p>
+            <w:pPr>
+              <w:jc w:val="center"/>
+            </w:pPr>
+            <w:r>
+              <w:rPr>
+                <w:b/>
+                <w:bCs/>
+                <w:color w:val="FFFFFF"/>
+                <w:sz w:val="19"/>
+                <w:szCs w:val="19"/>
+              </w:rPr>
+              <w:t xml:space="preserve">−50 %</w:t>
+            </w:r>
+          </w:p>
+        </w:tc>
+        <w:tc>
+          <w:tcPr>
+            <w:tcW w:type="dxa" w:w="1100"/>
+            <w:tcBorders>
+              <w:top w:val="single" w:color="BFBFBF" w:sz="4"/>
+              <w:left w:val="single" w:color="BFBFBF" w:sz="4"/>
+              <w:bottom w:val="single" w:color="BFBFBF" w:sz="4"/>
+              <w:right w:val="single" w:color="BFBFBF" w:sz="4"/>
+            </w:tcBorders>
+            <w:shd w:fill="1F4E78" w:color="auto" w:val="clear"/>
+            <w:tcMar>
+              <w:top w:type="dxa" w:w="60"/>
+              <w:left w:type="dxa" w:w="100"/>
+              <w:bottom w:type="dxa" w:w="60"/>
+              <w:right w:type="dxa" w:w="100"/>
+            </w:tcMar>
+          </w:tcPr>
+          <w:p>
+            <w:pPr>
+              <w:jc w:val="center"/>
+            </w:pPr>
+            <w:r>
+              <w:rPr>
+                <w:b/>
+                <w:bCs/>
+                <w:color w:val="FFFFFF"/>
+                <w:sz w:val="19"/>
+                <w:szCs w:val="19"/>
+              </w:rPr>
+              <w:t xml:space="preserve">−30 %</w:t>
+            </w:r>
+          </w:p>
+        </w:tc>
+        <w:tc>
+          <w:tcPr>
+            <w:tcW w:type="dxa" w:w="1100"/>
+            <w:tcBorders>
+              <w:top w:val="single" w:color="BFBFBF" w:sz="4"/>
+              <w:left w:val="single" w:color="BFBFBF" w:sz="4"/>
+              <w:bottom w:val="single" w:color="BFBFBF" w:sz="4"/>
+              <w:right w:val="single" w:color="BFBFBF" w:sz="4"/>
+            </w:tcBorders>
+            <w:shd w:fill="1F4E78" w:color="auto" w:val="clear"/>
+            <w:tcMar>
+              <w:top w:type="dxa" w:w="60"/>
+              <w:left w:type="dxa" w:w="100"/>
+              <w:bottom w:type="dxa" w:w="60"/>
+              <w:right w:type="dxa" w:w="100"/>
+            </w:tcMar>
+          </w:tcPr>
+          <w:p>
+            <w:pPr>
+              <w:jc w:val="center"/>
+            </w:pPr>
+            <w:r>
+              <w:rPr>
+                <w:b/>
+                <w:bCs/>
+                <w:color w:val="FFFFFF"/>
+                <w:sz w:val="19"/>
+                <w:szCs w:val="19"/>
+              </w:rPr>
+              <w:t xml:space="preserve">−10 %</w:t>
+            </w:r>
+          </w:p>
+        </w:tc>
+        <w:tc>
+          <w:tcPr>
+            <w:tcW w:type="dxa" w:w="1100"/>
+            <w:tcBorders>
+              <w:top w:val="single" w:color="BFBFBF" w:sz="4"/>
+              <w:left w:val="single" w:color="BFBFBF" w:sz="4"/>
+              <w:bottom w:val="single" w:color="BFBFBF" w:sz="4"/>
+              <w:right w:val="single" w:color="BFBFBF" w:sz="4"/>
+            </w:tcBorders>
+            <w:shd w:fill="1F4E78" w:color="auto" w:val="clear"/>
+            <w:tcMar>
+              <w:top w:type="dxa" w:w="60"/>
+              <w:left w:type="dxa" w:w="100"/>
+              <w:bottom w:type="dxa" w:w="60"/>
+              <w:right w:type="dxa" w:w="100"/>
+            </w:tcMar>
+          </w:tcPr>
+          <w:p>
+            <w:pPr>
+              <w:jc w:val="center"/>
+            </w:pPr>
+            <w:r>
+              <w:rPr>
+                <w:b/>
+                <w:bCs/>
+                <w:color w:val="FFFFFF"/>
+                <w:sz w:val="19"/>
+                <w:szCs w:val="19"/>
+              </w:rPr>
+              <w:t xml:space="preserve">+10 %</w:t>
+            </w:r>
+          </w:p>
+        </w:tc>
+        <w:tc>
+          <w:tcPr>
+            <w:tcW w:type="dxa" w:w="1100"/>
+            <w:tcBorders>
+              <w:top w:val="single" w:color="BFBFBF" w:sz="4"/>
+              <w:left w:val="single" w:color="BFBFBF" w:sz="4"/>
+              <w:bottom w:val="single" w:color="BFBFBF" w:sz="4"/>
+              <w:right w:val="single" w:color="BFBFBF" w:sz="4"/>
+            </w:tcBorders>
+            <w:shd w:fill="1F4E78" w:color="auto" w:val="clear"/>
+            <w:tcMar>
+              <w:top w:type="dxa" w:w="60"/>
+              <w:left w:type="dxa" w:w="100"/>
+              <w:bottom w:type="dxa" w:w="60"/>
+              <w:right w:type="dxa" w:w="100"/>
+            </w:tcMar>
+          </w:tcPr>
+          <w:p>
+            <w:pPr>
+              <w:jc w:val="center"/>
+            </w:pPr>
+            <w:r>
+              <w:rPr>
+                <w:b/>
+                <w:bCs/>
+                <w:color w:val="FFFFFF"/>
+                <w:sz w:val="19"/>
+                <w:szCs w:val="19"/>
+              </w:rPr>
+              <w:t xml:space="preserve">+30 %</w:t>
+            </w:r>
+          </w:p>
+        </w:tc>
+        <w:tc>
+          <w:tcPr>
+            <w:tcW w:type="dxa" w:w="1100"/>
+            <w:tcBorders>
+              <w:top w:val="single" w:color="BFBFBF" w:sz="4"/>
+              <w:left w:val="single" w:color="BFBFBF" w:sz="4"/>
+              <w:bottom w:val="single" w:color="BFBFBF" w:sz="4"/>
+              <w:right w:val="single" w:color="BFBFBF" w:sz="4"/>
+            </w:tcBorders>
+            <w:shd w:fill="1F4E78" w:color="auto" w:val="clear"/>
+            <w:tcMar>
+              <w:top w:type="dxa" w:w="60"/>
+              <w:left w:type="dxa" w:w="100"/>
+              <w:bottom w:type="dxa" w:w="60"/>
+              <w:right w:type="dxa" w:w="100"/>
+            </w:tcMar>
+          </w:tcPr>
+          <w:p>
+            <w:pPr>
+              <w:jc w:val="center"/>
+            </w:pPr>
+            <w:r>
+              <w:rPr>
+                <w:b/>
+                <w:bCs/>
+                <w:color w:val="FFFFFF"/>
+                <w:sz w:val="19"/>
+                <w:szCs w:val="19"/>
+              </w:rPr>
+              <w:t xml:space="preserve">+50 %</w:t>
+            </w:r>
+          </w:p>
+        </w:tc>
+      </w:tr>
+      <w:tr>
+        <w:tc>
+          <w:tcPr>
+            <w:tcW w:type="dxa" w:w="2426"/>
+            <w:tcBorders>
+              <w:top w:val="single" w:color="BFBFBF" w:sz="4"/>
+              <w:left w:val="single" w:color="BFBFBF" w:sz="4"/>
+              <w:bottom w:val="single" w:color="BFBFBF" w:sz="4"/>
+              <w:right w:val="single" w:color="BFBFBF" w:sz="4"/>
+            </w:tcBorders>
+            <w:shd w:fill="E2EFDA" w:color="auto" w:val="clear"/>
+            <w:tcMar>
+              <w:top w:type="dxa" w:w="60"/>
+              <w:left w:type="dxa" w:w="100"/>
+              <w:bottom w:type="dxa" w:w="60"/>
+              <w:right w:type="dxa" w:w="100"/>
+            </w:tcMar>
+          </w:tcPr>
+          <w:p>
+            <w:pPr>
+              <w:jc w:val="left"/>
+            </w:pPr>
+            <w:r>
+              <w:rPr>
+                <w:b/>
+                <w:bCs/>
+                <w:sz w:val="19"/>
+                <w:szCs w:val="19"/>
+              </w:rPr>
+              <w:t xml:space="preserve">WTP faussée</w:t>
+            </w:r>
+          </w:p>
+        </w:tc>
+        <w:tc>
+          <w:tcPr>
+            <w:tcW w:type="dxa" w:w="1100"/>
+            <w:tcBorders>
+              <w:top w:val="single" w:color="BFBFBF" w:sz="4"/>
+              <w:left w:val="single" w:color="BFBFBF" w:sz="4"/>
+              <w:bottom w:val="single" w:color="BFBFBF" w:sz="4"/>
+              <w:right w:val="single" w:color="BFBFBF" w:sz="4"/>
+            </w:tcBorders>
+            <w:shd w:fill="E2EFDA" w:color="auto" w:val="clear"/>
+            <w:tcMar>
+              <w:top w:type="dxa" w:w="60"/>
+              <w:left w:type="dxa" w:w="100"/>
+              <w:bottom w:type="dxa" w:w="60"/>
+              <w:right w:type="dxa" w:w="100"/>
+            </w:tcMar>
+          </w:tcPr>
+          <w:p>
+            <w:pPr>
+              <w:jc w:val="center"/>
+            </w:pPr>
+            <w:r>
+              <w:rPr>
+                <w:b/>
+                <w:bCs/>
+                <w:sz w:val="19"/>
+                <w:szCs w:val="19"/>
+              </w:rPr>
+              <w:t xml:space="preserve">75,8</w:t>
+            </w:r>
+          </w:p>
+        </w:tc>
+        <w:tc>
+          <w:tcPr>
+            <w:tcW w:type="dxa" w:w="1100"/>
+            <w:tcBorders>
+              <w:top w:val="single" w:color="BFBFBF" w:sz="4"/>
+              <w:left w:val="single" w:color="BFBFBF" w:sz="4"/>
+              <w:bottom w:val="single" w:color="BFBFBF" w:sz="4"/>
+              <w:right w:val="single" w:color="BFBFBF" w:sz="4"/>
+            </w:tcBorders>
+            <w:shd w:fill="E2EFDA" w:color="auto" w:val="clear"/>
+            <w:tcMar>
+              <w:top w:type="dxa" w:w="60"/>
+              <w:left w:type="dxa" w:w="100"/>
+              <w:bottom w:type="dxa" w:w="60"/>
+              <w:right w:type="dxa" w:w="100"/>
+            </w:tcMar>
+          </w:tcPr>
+          <w:p>
+            <w:pPr>
+              <w:jc w:val="center"/>
+            </w:pPr>
+            <w:r>
+              <w:rPr>
+                <w:b/>
+                <w:bCs/>
+                <w:sz w:val="19"/>
+                <w:szCs w:val="19"/>
+              </w:rPr>
+              <w:t xml:space="preserve">91,9</w:t>
+            </w:r>
+          </w:p>
+        </w:tc>
+        <w:tc>
+          <w:tcPr>
+            <w:tcW w:type="dxa" w:w="1100"/>
+            <w:tcBorders>
+              <w:top w:val="single" w:color="BFBFBF" w:sz="4"/>
+              <w:left w:val="single" w:color="BFBFBF" w:sz="4"/>
+              <w:bottom w:val="single" w:color="BFBFBF" w:sz="4"/>
+              <w:right w:val="single" w:color="BFBFBF" w:sz="4"/>
+            </w:tcBorders>
+            <w:shd w:fill="E2EFDA" w:color="auto" w:val="clear"/>
+            <w:tcMar>
+              <w:top w:type="dxa" w:w="60"/>
+              <w:left w:type="dxa" w:w="100"/>
+              <w:bottom w:type="dxa" w:w="60"/>
+              <w:right w:type="dxa" w:w="100"/>
+            </w:tcMar>
+          </w:tcPr>
+          <w:p>
+            <w:pPr>
+              <w:jc w:val="center"/>
+            </w:pPr>
+            <w:r>
+              <w:rPr>
+                <w:b/>
+                <w:bCs/>
+                <w:sz w:val="19"/>
+                <w:szCs w:val="19"/>
+              </w:rPr>
+              <w:t xml:space="preserve">99,2</w:t>
+            </w:r>
+          </w:p>
+        </w:tc>
+        <w:tc>
+          <w:tcPr>
+            <w:tcW w:type="dxa" w:w="1100"/>
+            <w:tcBorders>
+              <w:top w:val="single" w:color="BFBFBF" w:sz="4"/>
+              <w:left w:val="single" w:color="BFBFBF" w:sz="4"/>
+              <w:bottom w:val="single" w:color="BFBFBF" w:sz="4"/>
+              <w:right w:val="single" w:color="BFBFBF" w:sz="4"/>
+            </w:tcBorders>
+            <w:shd w:fill="E2EFDA" w:color="auto" w:val="clear"/>
+            <w:tcMar>
+              <w:top w:type="dxa" w:w="60"/>
+              <w:left w:type="dxa" w:w="100"/>
+              <w:bottom w:type="dxa" w:w="60"/>
+              <w:right w:type="dxa" w:w="100"/>
+            </w:tcMar>
+          </w:tcPr>
+          <w:p>
+            <w:pPr>
+              <w:jc w:val="center"/>
+            </w:pPr>
+            <w:r>
+              <w:rPr>
+                <w:b/>
+                <w:bCs/>
+                <w:sz w:val="19"/>
+                <w:szCs w:val="19"/>
+              </w:rPr>
+              <w:t xml:space="preserve">99,5</w:t>
+            </w:r>
+          </w:p>
+        </w:tc>
+        <w:tc>
+          <w:tcPr>
+            <w:tcW w:type="dxa" w:w="1100"/>
+            <w:tcBorders>
+              <w:top w:val="single" w:color="BFBFBF" w:sz="4"/>
+              <w:left w:val="single" w:color="BFBFBF" w:sz="4"/>
+              <w:bottom w:val="single" w:color="BFBFBF" w:sz="4"/>
+              <w:right w:val="single" w:color="BFBFBF" w:sz="4"/>
+            </w:tcBorders>
+            <w:shd w:fill="E2EFDA" w:color="auto" w:val="clear"/>
+            <w:tcMar>
+              <w:top w:type="dxa" w:w="60"/>
+              <w:left w:type="dxa" w:w="100"/>
+              <w:bottom w:type="dxa" w:w="60"/>
+              <w:right w:type="dxa" w:w="100"/>
+            </w:tcMar>
+          </w:tcPr>
+          <w:p>
+            <w:pPr>
+              <w:jc w:val="center"/>
+            </w:pPr>
+            <w:r>
+              <w:rPr>
+                <w:b/>
+                <w:bCs/>
+                <w:sz w:val="19"/>
+                <w:szCs w:val="19"/>
+              </w:rPr>
+              <w:t xml:space="preserve">96,3</w:t>
+            </w:r>
+          </w:p>
+        </w:tc>
+        <w:tc>
+          <w:tcPr>
+            <w:tcW w:type="dxa" w:w="1100"/>
+            <w:tcBorders>
+              <w:top w:val="single" w:color="BFBFBF" w:sz="4"/>
+              <w:left w:val="single" w:color="BFBFBF" w:sz="4"/>
+              <w:bottom w:val="single" w:color="BFBFBF" w:sz="4"/>
+              <w:right w:val="single" w:color="BFBFBF" w:sz="4"/>
+            </w:tcBorders>
+            <w:shd w:fill="E2EFDA" w:color="auto" w:val="clear"/>
+            <w:tcMar>
+              <w:top w:type="dxa" w:w="60"/>
+              <w:left w:type="dxa" w:w="100"/>
+              <w:bottom w:type="dxa" w:w="60"/>
+              <w:right w:type="dxa" w:w="100"/>
+            </w:tcMar>
+          </w:tcPr>
+          <w:p>
+            <w:pPr>
+              <w:jc w:val="center"/>
+            </w:pPr>
+            <w:r>
+              <w:rPr>
+                <w:b/>
+                <w:bCs/>
+                <w:sz w:val="19"/>
+                <w:szCs w:val="19"/>
+              </w:rPr>
+              <w:t xml:space="preserve">92,9</w:t>
+            </w:r>
+          </w:p>
+        </w:tc>
+      </w:tr>
+      <w:tr>
+        <w:tc>
+          <w:tcPr>
+            <w:tcW w:type="dxa" w:w="2426"/>
+            <w:tcBorders>
+              <w:top w:val="single" w:color="BFBFBF" w:sz="4"/>
+              <w:left w:val="single" w:color="BFBFBF" w:sz="4"/>
+              <w:bottom w:val="single" w:color="BFBFBF" w:sz="4"/>
+              <w:right w:val="single" w:color="BFBFBF" w:sz="4"/>
+            </w:tcBorders>
+            <w:tcMar>
+              <w:top w:type="dxa" w:w="60"/>
+              <w:left w:type="dxa" w:w="100"/>
+              <w:bottom w:type="dxa" w:w="60"/>
+              <w:right w:type="dxa" w:w="100"/>
+            </w:tcMar>
+          </w:tcPr>
+          <w:p>
+            <w:pPr>
+              <w:jc w:val="left"/>
+            </w:pPr>
+            <w:r>
+              <w:rPr>
+                <w:b w:val="false"/>
+                <w:bCs w:val="false"/>
+                <w:sz w:val="19"/>
+                <w:szCs w:val="19"/>
+              </w:rPr>
+              <w:t xml:space="preserve">λ faussées</w:t>
+            </w:r>
+          </w:p>
+        </w:tc>
+        <w:tc>
+          <w:tcPr>
+            <w:tcW w:type="dxa" w:w="1100"/>
+            <w:tcBorders>
+              <w:top w:val="single" w:color="BFBFBF" w:sz="4"/>
+              <w:left w:val="single" w:color="BFBFBF" w:sz="4"/>
+              <w:bottom w:val="single" w:color="BFBFBF" w:sz="4"/>
+              <w:right w:val="single" w:color="BFBFBF" w:sz="4"/>
+            </w:tcBorders>
+            <w:tcMar>
+              <w:top w:type="dxa" w:w="60"/>
+              <w:left w:type="dxa" w:w="100"/>
+              <w:bottom w:type="dxa" w:w="60"/>
+              <w:right w:type="dxa" w:w="100"/>
+            </w:tcMar>
+          </w:tcPr>
+          <w:p>
+            <w:pPr>
+              <w:jc w:val="center"/>
+            </w:pPr>
+            <w:r>
+              <w:rPr>
+                <w:b w:val="false"/>
+                <w:bCs w:val="false"/>
+                <w:sz w:val="19"/>
+                <w:szCs w:val="19"/>
+              </w:rPr>
+              <w:t xml:space="preserve">95,0</w:t>
+            </w:r>
+          </w:p>
+        </w:tc>
+        <w:tc>
+          <w:tcPr>
+            <w:tcW w:type="dxa" w:w="1100"/>
+            <w:tcBorders>
+              <w:top w:val="single" w:color="BFBFBF" w:sz="4"/>
+              <w:left w:val="single" w:color="BFBFBF" w:sz="4"/>
+              <w:bottom w:val="single" w:color="BFBFBF" w:sz="4"/>
+              <w:right w:val="single" w:color="BFBFBF" w:sz="4"/>
+            </w:tcBorders>
+            <w:tcMar>
+              <w:top w:type="dxa" w:w="60"/>
+              <w:left w:type="dxa" w:w="100"/>
+              <w:bottom w:type="dxa" w:w="60"/>
+              <w:right w:type="dxa" w:w="100"/>
+            </w:tcMar>
+          </w:tcPr>
+          <w:p>
+            <w:pPr>
+              <w:jc w:val="center"/>
+            </w:pPr>
+            <w:r>
+              <w:rPr>
+                <w:b w:val="false"/>
+                <w:bCs w:val="false"/>
+                <w:sz w:val="19"/>
+                <w:szCs w:val="19"/>
+              </w:rPr>
+              <w:t xml:space="preserve">98,6</w:t>
+            </w:r>
+          </w:p>
+        </w:tc>
+        <w:tc>
+          <w:tcPr>
+            <w:tcW w:type="dxa" w:w="1100"/>
+            <w:tcBorders>
+              <w:top w:val="single" w:color="BFBFBF" w:sz="4"/>
+              <w:left w:val="single" w:color="BFBFBF" w:sz="4"/>
+              <w:bottom w:val="single" w:color="BFBFBF" w:sz="4"/>
+              <w:right w:val="single" w:color="BFBFBF" w:sz="4"/>
+            </w:tcBorders>
+            <w:tcMar>
+              <w:top w:type="dxa" w:w="60"/>
+              <w:left w:type="dxa" w:w="100"/>
+              <w:bottom w:type="dxa" w:w="60"/>
+              <w:right w:type="dxa" w:w="100"/>
+            </w:tcMar>
+          </w:tcPr>
+          <w:p>
+            <w:pPr>
+              <w:jc w:val="center"/>
+            </w:pPr>
+            <w:r>
+              <w:rPr>
+                <w:b w:val="false"/>
+                <w:bCs w:val="false"/>
+                <w:sz w:val="19"/>
+                <w:szCs w:val="19"/>
+              </w:rPr>
+              <w:t xml:space="preserve">99,8</w:t>
+            </w:r>
+          </w:p>
+        </w:tc>
+        <w:tc>
+          <w:tcPr>
+            <w:tcW w:type="dxa" w:w="1100"/>
+            <w:tcBorders>
+              <w:top w:val="single" w:color="BFBFBF" w:sz="4"/>
+              <w:left w:val="single" w:color="BFBFBF" w:sz="4"/>
+              <w:bottom w:val="single" w:color="BFBFBF" w:sz="4"/>
+              <w:right w:val="single" w:color="BFBFBF" w:sz="4"/>
+            </w:tcBorders>
+            <w:tcMar>
+              <w:top w:type="dxa" w:w="60"/>
+              <w:left w:type="dxa" w:w="100"/>
+              <w:bottom w:type="dxa" w:w="60"/>
+              <w:right w:type="dxa" w:w="100"/>
+            </w:tcMar>
+          </w:tcPr>
+          <w:p>
+            <w:pPr>
+              <w:jc w:val="center"/>
+            </w:pPr>
+            <w:r>
+              <w:rPr>
+                <w:b w:val="false"/>
+                <w:bCs w:val="false"/>
+                <w:sz w:val="19"/>
+                <w:szCs w:val="19"/>
+              </w:rPr>
+              <w:t xml:space="preserve">99,9</w:t>
+            </w:r>
+          </w:p>
+        </w:tc>
+        <w:tc>
+          <w:tcPr>
+            <w:tcW w:type="dxa" w:w="1100"/>
+            <w:tcBorders>
+              <w:top w:val="single" w:color="BFBFBF" w:sz="4"/>
+              <w:left w:val="single" w:color="BFBFBF" w:sz="4"/>
+              <w:bottom w:val="single" w:color="BFBFBF" w:sz="4"/>
+              <w:right w:val="single" w:color="BFBFBF" w:sz="4"/>
+            </w:tcBorders>
+            <w:tcMar>
+              <w:top w:type="dxa" w:w="60"/>
+              <w:left w:type="dxa" w:w="100"/>
+              <w:bottom w:type="dxa" w:w="60"/>
+              <w:right w:type="dxa" w:w="100"/>
+            </w:tcMar>
+          </w:tcPr>
+          <w:p>
+            <w:pPr>
+              <w:jc w:val="center"/>
+            </w:pPr>
+            <w:r>
+              <w:rPr>
+                <w:b w:val="false"/>
+                <w:bCs w:val="false"/>
+                <w:sz w:val="19"/>
+                <w:szCs w:val="19"/>
+              </w:rPr>
+              <w:t xml:space="preserve">98,9</w:t>
+            </w:r>
+          </w:p>
+        </w:tc>
+        <w:tc>
+          <w:tcPr>
+            <w:tcW w:type="dxa" w:w="1100"/>
+            <w:tcBorders>
+              <w:top w:val="single" w:color="BFBFBF" w:sz="4"/>
+              <w:left w:val="single" w:color="BFBFBF" w:sz="4"/>
+              <w:bottom w:val="single" w:color="BFBFBF" w:sz="4"/>
+              <w:right w:val="single" w:color="BFBFBF" w:sz="4"/>
+            </w:tcBorders>
+            <w:tcMar>
+              <w:top w:type="dxa" w:w="60"/>
+              <w:left w:type="dxa" w:w="100"/>
+              <w:bottom w:type="dxa" w:w="60"/>
+              <w:right w:type="dxa" w:w="100"/>
+            </w:tcMar>
+          </w:tcPr>
+          <w:p>
+            <w:pPr>
+              <w:jc w:val="center"/>
+            </w:pPr>
+            <w:r>
+              <w:rPr>
+                <w:b w:val="false"/>
+                <w:bCs w:val="false"/>
+                <w:sz w:val="19"/>
+                <w:szCs w:val="19"/>
+              </w:rPr>
+              <w:t xml:space="preserve">97,2</w:t>
+            </w:r>
+          </w:p>
+        </w:tc>
+      </w:tr>
+    </w:tbl>
+    <w:p>
+      <w:pPr>
+        <w:spacing w:before="60" w:after="120"/>
+      </w:pPr>
+      <w:r>
+        <w:t xml:space="preserve">Pour comparaison, le meilleur prix fixe (170 €) atteint 96,1 % de l'optimum.</w:t>
+      </w:r>
+    </w:p>
+    <w:p>
+      <w:pPr>
+        <w:keepNext/>
+        <w:spacing w:before="160" w:after="60"/>
+      </w:pPr>
+      <w:r>
+        <w:rPr>
+          <w:b/>
+          <w:bCs/>
+          <w:color w:val="1F4E78"/>
+        </w:rPr>
+        <w:t xml:space="preserve">Décision</w:t>
+      </w:r>
+    </w:p>
+    <w:p>
+      <w:pPr>
+        <w:spacing w:after="120"/>
+      </w:pPr>
+      <w:r>
+        <w:t xml:space="preserve">Fausser la WTP dans E2 (DemandModel.with_error). Une ligne avec λ faussé est optionnelle, si le temps le permet.</w:t>
+      </w:r>
+    </w:p>
+    <w:p>
+      <w:pPr>
+        <w:keepNext/>
+        <w:spacing w:before="160" w:after="60"/>
+      </w:pPr>
+      <w:r>
+        <w:rPr>
+          <w:b/>
+          <w:bCs/>
+          <w:color w:val="1F4E78"/>
+        </w:rPr>
+        <w:t xml:space="preserve">Argument (à dire à l'oral / dans le rapport)</w:t>
+      </w:r>
+    </w:p>
+    <w:p>
+      <w:pPr>
+        <w:pStyle w:val="ListParagraph"/>
+        <w:numPr>
+          <w:ilvl w:val="0"/>
+          <w:numId w:val="2"/>
+        </w:numPr>
+        <w:spacing w:after="60"/>
+      </w:pPr>
+      <w:r>
+        <w:t xml:space="preserve">Une erreur sur λ coûte au plus 5 % : la carte de E2 serait presque uniforme et n'aurait rien à montrer.</w:t>
+      </w:r>
+    </w:p>
+    <w:p>
+      <w:pPr>
+        <w:pStyle w:val="ListParagraph"/>
+        <w:numPr>
+          <w:ilvl w:val="0"/>
+          <w:numId w:val="2"/>
+        </w:numPr>
+        <w:spacing w:after="60"/>
+      </w:pPr>
+      <w:r>
+        <w:t xml:space="preserve">Une erreur sur la WTP coûte jusqu'à 24 % : c'est elle qui crée un vrai point de bascule entre planifier et apprendre.</w:t>
+      </w:r>
+    </w:p>
+    <w:p>
+      <w:pPr>
+        <w:pStyle w:val="ListParagraph"/>
+        <w:numPr>
+          <w:ilvl w:val="0"/>
+          <w:numId w:val="2"/>
+        </w:numPr>
+        <w:spacing w:after="60"/>
+      </w:pPr>
+      <w:r>
+        <w:t xml:space="preserve">Elle est asymétrique : sous-estimer ce que les clients acceptent de payer fait vendre trop bon marché et remplir l'avion trop tôt, ce qui coûte bien plus cher que de le surestimer.</w:t>
+      </w:r>
+    </w:p>
+    <w:p>
+      <w:pPr>
+        <w:pStyle w:val="ListParagraph"/>
+        <w:numPr>
+          <w:ilvl w:val="0"/>
+          <w:numId w:val="2"/>
+        </w:numPr>
+        <w:spacing w:after="60"/>
+      </w:pPr>
+      <w:r>
+        <w:t xml:space="preserve">Au-delà d'environ ±30 %, la DP faussée fait moins bien qu'un simple prix fixe : premier point de bascule, avant même le Q-learning.</w:t>
+      </w:r>
+    </w:p>
+    <w:p>
+      <w:pPr>
+        <w:pStyle w:val="ListParagraph"/>
+        <w:numPr>
+          <w:ilvl w:val="0"/>
+          <w:numId w:val="2"/>
+        </w:numPr>
+        <w:spacing w:after="60"/>
+      </w:pPr>
+      <w:r>
+        <w:t xml:space="preserve">Interprétation : la DP est robuste aux erreurs de volume (combien de clients), mais sensible aux erreurs de sensibilité au prix, qui sont justement ce qu'elle utilise pour choisir le prix.</w:t>
+      </w:r>
+    </w:p>
+    <w:p>
+      <w:pPr>
+        <w:pStyle w:val="Heading2"/>
+      </w:pPr>
+      <w:r>
+        <w:t xml:space="preserve">D7 · Q-learning : choix de départ fidèles au cours</w:t>
+      </w:r>
+    </w:p>
+    <w:p>
+      <w:pPr>
+        <w:spacing w:after="120"/>
+      </w:pPr>
+      <w:r>
+        <w:rPr>
+          <w:b/>
+          <w:bCs/>
+        </w:rPr>
+        <w:t xml:space="preserve">Statut :</w:t>
+      </w:r>
+      <w:r>
+        <w:t xml:space="preserve"> Adoptée (valeurs finales dans #14)    </w:t>
+      </w:r>
+      <w:r>
+        <w:rPr>
+          <w:b/>
+          <w:bCs/>
+        </w:rPr>
+        <w:t xml:space="preserve">Date :</w:t>
+      </w:r>
+      <w:r>
+        <w:t xml:space="preserve"> 2026-10-09    </w:t>
+      </w:r>
+      <w:r>
+        <w:rPr>
+          <w:b/>
+          <w:bCs/>
+        </w:rPr>
+        <w:t xml:space="preserve">Issue :</w:t>
+      </w:r>
+      <w:r>
+        <w:t xml:space="preserve"> #13, #14</w:t>
+      </w:r>
+    </w:p>
+    <w:p>
+      <w:pPr>
+        <w:keepNext/>
+        <w:spacing w:before="160" w:after="60"/>
+      </w:pPr>
+      <w:r>
+        <w:rPr>
+          <w:b/>
+          <w:bCs/>
+          <w:color w:val="1F4E78"/>
+        </w:rPr>
+        <w:t xml:space="preserve">Contexte</w:t>
+      </w:r>
+    </w:p>
+    <w:p>
+      <w:pPr>
+        <w:spacing w:after="120"/>
+      </w:pPr>
+      <w:r>
+        <w:t xml:space="preserve">Le Q-learning doit être comparable à celui du cours (RL1, RL2) et réglé avant les expériences, pour que E1 et E2 mesurent la vraie question et pas un agent mal réglé.</w:t>
+      </w:r>
+    </w:p>
+    <w:p>
+      <w:pPr>
+        <w:keepNext/>
+        <w:spacing w:before="160" w:after="60"/>
+      </w:pPr>
+      <w:r>
+        <w:rPr>
+          <w:b/>
+          <w:bCs/>
+          <w:color w:val="1F4E78"/>
+        </w:rPr>
+        <w:t xml:space="preserve">Décision</w:t>
+      </w:r>
+    </w:p>
+    <w:p>
+      <w:pPr>
+        <w:spacing w:after="120"/>
+      </w:pPr>
+      <w:r>
+        <w:t xml:space="preserve">Q = 0 partout ; mise à jour off-policy avec max ; valeur 0 dans les états terminaux ; ε-greedy avec ε qui part de 1 puis décroît ; α constant ou décroissant ; budgets d'épisodes d'E2 sur une échelle logarithmique (≈ 100 → 100 000). Les valeurs finales de α et de ε sont fixées par un petit balayage dans #14.</w:t>
+      </w:r>
+    </w:p>
+    <w:p>
+      <w:pPr>
+        <w:keepNext/>
+        <w:spacing w:before="160" w:after="60"/>
+      </w:pPr>
+      <w:r>
+        <w:rPr>
+          <w:b/>
+          <w:bCs/>
+          <w:color w:val="1F4E78"/>
+        </w:rPr>
+        <w:t xml:space="preserve">Argument (à dire à l'oral / dans le rapport)</w:t>
+      </w:r>
+    </w:p>
+    <w:p>
+      <w:pPr>
+        <w:pStyle w:val="ListParagraph"/>
+        <w:numPr>
+          <w:ilvl w:val="0"/>
+          <w:numId w:val="2"/>
+        </w:numPr>
+        <w:spacing w:after="60"/>
+      </w:pPr>
+      <w:r>
+        <w:t xml:space="preserve">Ce sont exactement les choix présentés en cours (ε commence à 1 puis décroît, Q-table initialisée à 0).</w:t>
+      </w:r>
+    </w:p>
+    <w:p>
+      <w:pPr>
+        <w:pStyle w:val="ListParagraph"/>
+        <w:numPr>
+          <w:ilvl w:val="0"/>
+          <w:numId w:val="2"/>
+        </w:numPr>
+        <w:spacing w:after="60"/>
+      </w:pPr>
+      <w:r>
+        <w:t xml:space="preserve">Le réglage séparé (#14) évite de conclure « le Q-learning perd » alors qu'il est seulement mal réglé.</w:t>
+      </w:r>
+    </w:p>
+    <w:p>
+      <w:pPr>
+        <w:pStyle w:val="ListParagraph"/>
+        <w:numPr>
+          <w:ilvl w:val="0"/>
+          <w:numId w:val="2"/>
+        </w:numPr>
+        <w:spacing w:after="60"/>
+      </w:pPr>
+      <w:r>
+        <w:t xml:space="preserve">L'échelle logarithmique des budgets permet de voir à la fois le régime « peu de données » et le régime « convergé ».</w:t>
+      </w:r>
+    </w:p>
+    <w:p>
+      <w:pPr>
+        <w:pStyle w:val="Heading2"/>
+      </w:pPr>
+      <w:r>
+        <w:t xml:space="preserve">D8 · Interface de l'environnement : step() renvoie (state, reward, done)</w:t>
+      </w:r>
+    </w:p>
+    <w:p>
+      <w:pPr>
+        <w:spacing w:after="120"/>
+      </w:pPr>
+      <w:r>
+        <w:rPr>
+          <w:b/>
+          <w:bCs/>
+        </w:rPr>
+        <w:t xml:space="preserve">Statut :</w:t>
+      </w:r>
+      <w:r>
+        <w:t xml:space="preserve"> Adoptée    </w:t>
+      </w:r>
+      <w:r>
+        <w:rPr>
+          <w:b/>
+          <w:bCs/>
+        </w:rPr>
+        <w:t xml:space="preserve">Date :</w:t>
+      </w:r>
+      <w:r>
+        <w:t xml:space="preserve"> 2026-10-09    </w:t>
+      </w:r>
+      <w:r>
+        <w:rPr>
+          <w:b/>
+          <w:bCs/>
+        </w:rPr>
+        <w:t xml:space="preserve">Issue :</w:t>
+      </w:r>
+      <w:r>
+        <w:t xml:space="preserve"> #3</w:t>
+      </w:r>
+    </w:p>
+    <w:p>
+      <w:pPr>
+        <w:keepNext/>
+        <w:spacing w:before="160" w:after="60"/>
+      </w:pPr>
+      <w:r>
+        <w:rPr>
+          <w:b/>
+          <w:bCs/>
+          <w:color w:val="1F4E78"/>
+        </w:rPr>
+        <w:t xml:space="preserve">Contexte</w:t>
+      </w:r>
+    </w:p>
+    <w:p>
+      <w:pPr>
+        <w:spacing w:after="120"/>
+      </w:pPr>
+      <w:r>
+        <w:t xml:space="preserve">Le gym du cours renvoie (state, reward, done, info). Notre AirlineEnv, classe maison, renvoie (state, reward, done).</w:t>
+      </w:r>
+    </w:p>
+    <w:p>
+      <w:pPr>
+        <w:keepNext/>
+        <w:spacing w:before="160" w:after="60"/>
+      </w:pPr>
+      <w:r>
+        <w:rPr>
+          <w:b/>
+          <w:bCs/>
+          <w:color w:val="1F4E78"/>
+        </w:rPr>
+        <w:t xml:space="preserve">Décision</w:t>
+      </w:r>
+    </w:p>
+    <w:p>
+      <w:pPr>
+        <w:spacing w:after="120"/>
+      </w:pPr>
+      <w:r>
+        <w:t xml:space="preserve">Garder (state, reward, done).</w:t>
+      </w:r>
+    </w:p>
+    <w:p>
+      <w:pPr>
+        <w:keepNext/>
+        <w:spacing w:before="160" w:after="60"/>
+      </w:pPr>
+      <w:r>
+        <w:rPr>
+          <w:b/>
+          <w:bCs/>
+          <w:color w:val="1F4E78"/>
+        </w:rPr>
+        <w:t xml:space="preserve">Argument (à dire à l'oral / dans le rapport)</w:t>
+      </w:r>
+    </w:p>
+    <w:p>
+      <w:pPr>
+        <w:pStyle w:val="ListParagraph"/>
+        <w:numPr>
+          <w:ilvl w:val="0"/>
+          <w:numId w:val="2"/>
+        </w:numPr>
+        <w:spacing w:after="60"/>
+      </w:pPr>
+      <w:r>
+        <w:t xml:space="preserve">Plus simple, déjà testé (tests/test_env.py), et info n'apporte rien ici.</w:t>
+      </w:r>
+    </w:p>
+    <w:p>
+      <w:pPr>
+        <w:pStyle w:val="ListParagraph"/>
+        <w:numPr>
+          <w:ilvl w:val="0"/>
+          <w:numId w:val="2"/>
+        </w:numPr>
+        <w:spacing w:after="60"/>
+      </w:pPr>
+      <w:r>
+        <w:t xml:space="preserve">La boucle du cours s'adapte directement en retirant info ; reset() / step() restent identiques en esprit.</w:t>
+      </w:r>
+    </w:p>
+    <w:p>
+      <w:pPr>
+        <w:pStyle w:val="Heading2"/>
+      </w:pPr>
+      <w:r>
+        <w:t xml:space="preserve">D9 · Répartition : côté « Plan » / côté « Learn »</w:t>
+      </w:r>
+    </w:p>
+    <w:p>
+      <w:pPr>
+        <w:spacing w:after="120"/>
+      </w:pPr>
+      <w:r>
+        <w:rPr>
+          <w:b/>
+          <w:bCs/>
+        </w:rPr>
+        <w:t xml:space="preserve">Statut :</w:t>
+      </w:r>
+      <w:r>
+        <w:t xml:space="preserve"> Adoptée    </w:t>
+      </w:r>
+      <w:r>
+        <w:rPr>
+          <w:b/>
+          <w:bCs/>
+        </w:rPr>
+        <w:t xml:space="preserve">Date :</w:t>
+      </w:r>
+      <w:r>
+        <w:t xml:space="preserve"> 2026-10-09    </w:t>
+      </w:r>
+      <w:r>
+        <w:rPr>
+          <w:b/>
+          <w:bCs/>
+        </w:rPr>
+        <w:t xml:space="preserve">Issue :</w:t>
+      </w:r>
+      <w:r>
+        <w:t xml:space="preserve"> #10 à #15</w:t>
+      </w:r>
+    </w:p>
+    <w:p>
+      <w:pPr>
+        <w:keepNext/>
+        <w:spacing w:before="160" w:after="60"/>
+      </w:pPr>
+      <w:r>
+        <w:rPr>
+          <w:b/>
+          <w:bCs/>
+          <w:color w:val="1F4E78"/>
+        </w:rPr>
+        <w:t xml:space="preserve">Contexte</w:t>
+      </w:r>
+    </w:p>
+    <w:p>
+      <w:pPr>
+        <w:spacing w:after="120"/>
+      </w:pPr>
+      <w:r>
+        <w:t xml:space="preserve">Pour avancer en parallèle, chacun prend une partie indépendante, sans répartition stricte du reste.</w:t>
+      </w:r>
+    </w:p>
+    <w:p>
+      <w:pPr>
+        <w:keepNext/>
+        <w:spacing w:before="160" w:after="60"/>
+      </w:pPr>
+      <w:r>
+        <w:rPr>
+          <w:b/>
+          <w:bCs/>
+          <w:color w:val="1F4E78"/>
+        </w:rPr>
+        <w:t xml:space="preserve">Décision</w:t>
+      </w:r>
+    </w:p>
+    <w:p>
+      <w:pPr>
+        <w:spacing w:after="120"/>
+      </w:pPr>
+      <w:r>
+        <w:t xml:space="preserve">Imane : côté « Plan » (baselines #10, validation DP #11, heatmap #12, DP-faux de E2). Dia Eddine : côté « Learn » (Q-learning #13, SARSA #15, réglage #14, E1). E2 et E4 ensemble ; E3 côté Imane.</w:t>
+      </w:r>
+    </w:p>
+    <w:p>
+      <w:pPr>
+        <w:keepNext/>
+        <w:spacing w:before="160" w:after="60"/>
+      </w:pPr>
+      <w:r>
+        <w:rPr>
+          <w:b/>
+          <w:bCs/>
+          <w:color w:val="1F4E78"/>
+        </w:rPr>
+        <w:t xml:space="preserve">Argument (à dire à l'oral / dans le rapport)</w:t>
+      </w:r>
+    </w:p>
+    <w:p>
+      <w:pPr>
+        <w:pStyle w:val="ListParagraph"/>
+        <w:numPr>
+          <w:ilvl w:val="0"/>
+          <w:numId w:val="2"/>
+        </w:numPr>
+        <w:spacing w:after="60"/>
+      </w:pPr>
+      <w:r>
+        <w:t xml:space="preserve">Le Q-learning ne dépend que de l'environnement et de l'évaluation, déjà finis et testés : aucune attente entre nous.</w:t>
+      </w:r>
+    </w:p>
+    <w:p>
+      <w:pPr>
+        <w:pStyle w:val="ListParagraph"/>
+        <w:numPr>
+          <w:ilvl w:val="0"/>
+          <w:numId w:val="2"/>
+        </w:numPr>
+        <w:spacing w:after="60"/>
+      </w:pPr>
+      <w:r>
+        <w:t xml:space="preserve">Le découpage suit la question de recherche (Plan vs Learn) ; on se retrouve sur E2, qui combine les deux.</w:t>
+      </w:r>
+    </w:p>
+    <w:p>
+      <w:pPr>
+        <w:pStyle w:val="ListParagraph"/>
+        <w:numPr>
+          <w:ilvl w:val="0"/>
+          <w:numId w:val="2"/>
+        </w:numPr>
+        <w:spacing w:after="60"/>
+      </w:pPr>
+      <w:r>
+        <w:t xml:space="preserve">Chacun explique sa partie à l'autre, car à l'oral chacun doit pouvoir défendre tout le projet.</w:t>
       </w:r>
     </w:p>
     <w:p>

</xml_diff>